<commit_message>
feat(eval): loai bo alias map bang Spatio-Temporal Bipartite Matching, dong bo so lieu benchmark va dong goi tai lieu
</commit_message>
<xml_diff>
--- a/reports/Bao_cao_tien_do_DATN_Full_Pipeline_va_Thuc_nghiem_Video.docx
+++ b/reports/Bao_cao_tien_do_DATN_Full_Pipeline_va_Thuc_nghiem_Video.docx
@@ -363,8 +363,65 @@
           <w:rFonts w:ascii="Arial" w:hAnsi="Arial"/>
           <w:sz w:val="20"/>
         </w:rPr>
-        <w:t>Nhận thức rõ nguyên tắc kỹ thuật trong giám sát thực địa: Không có mô hình AI nào có độ chính xác tuyệt đối 100%, hệ thống được thiết kế theo triết lý Hệ thống Hỗ trợ Ra Quyết định (Decision Support System) với nhiều tầng lọc phòng thủ vững chắc:</w:t>
+        <w:t>Nhận thức rõ nguyên tắc kỹ thuật trong giám sát thực địa: Không có mô hình AI nào đạt độ chính xác 100% không sai sót, hệ thống được thiết kế theo triết lý Hệ thống Hỗ trợ Ra Quyết định (Decision Support System) với nhiều tầng lọc phòng thủ vững chắc:</w:t>
       </w:r>
+    </w:p>
+    <w:tbl>
+      <w:tblPr>
+        <w:tblW w:type="auto" w:w="0"/>
+        <w:jc w:val="center"/>
+        <w:tblLook w:firstColumn="1" w:firstRow="1" w:lastColumn="0" w:lastRow="0" w:noHBand="0" w:noVBand="1" w:val="04A0"/>
+      </w:tblPr>
+      <w:tblGrid>
+        <w:gridCol w:w="9029"/>
+      </w:tblGrid>
+      <w:tr>
+        <w:tc>
+          <w:tcPr>
+            <w:tcW w:type="dxa" w:w="9360"/>
+            <w:shd w:fill="F8FAFC"/>
+            <w:tcMar>
+              <w:top w:w="140" w:type="dxa"/>
+              <w:bottom w:w="140" w:type="dxa"/>
+              <w:left w:w="200" w:type="dxa"/>
+              <w:right w:w="200" w:type="dxa"/>
+            </w:tcMar>
+            <w:tcBorders>
+              <w:left w:val="single" w:sz="24" w:space="0" w:color="1E3A8A"/>
+              <w:top w:val="none"/>
+              <w:bottom w:val="none"/>
+              <w:right w:val="none"/>
+            </w:tcBorders>
+          </w:tcPr>
+          <w:p>
+            <w:pPr>
+              <w:spacing w:before="0" w:after="40"/>
+            </w:pPr>
+            <w:r>
+              <w:rPr>
+                <w:rFonts w:ascii="Arial" w:hAnsi="Arial"/>
+                <w:b/>
+                <w:color w:val="1E3A8A"/>
+                <w:sz w:val="20"/>
+              </w:rPr>
+              <w:t xml:space="preserve">Hành vi lấn chiếm hè phố hiện được điều chỉnh bởi Điều 12 Nghị định 168/2024/NĐ-CP (hiệu lực 01/01/2025; mức phạt 2-3 triệu đồng với cá nhân, 4-6 triệu đồng với tổ chức). Do tính chất 'trái phép' đòi hỏi đối chiếu giấy phép sử dụng tạm thời một phần hè phố theo đề án của UBND địa phương, hệ thống AI đóng vai trò lập hồ sơ bằng chứng số hóa sơ bộ; cán bộ có thẩm quyền là người thẩm định cuối cùng (Human-in-the-Loop) trước khi lập biên bản xử lý vi phạm. </w:t>
+            </w:r>
+            <w:r>
+              <w:rPr>
+                <w:rFonts w:ascii="Arial" w:hAnsi="Arial"/>
+                <w:color w:val="1E293B"/>
+                <w:sz w:val="19"/>
+              </w:rPr>
+              <w:t>Căn Cứ Pháp Lý &amp; Định Vị Hệ Thống Hỗ Trợ Ra Quyết Định (DSS):</w:t>
+            </w:r>
+          </w:p>
+        </w:tc>
+      </w:tr>
+    </w:tbl>
+    <w:p>
+      <w:pPr>
+        <w:spacing w:before="0" w:after="80"/>
+      </w:pPr>
     </w:p>
     <w:p>
       <w:pPr>
@@ -542,7 +599,7 @@
                 <w:color w:val="1E3A8A"/>
                 <w:sz w:val="20"/>
               </w:rPr>
-              <w:t xml:space="preserve">📌 TỐI ƯU CƠ SỞ DỮ LIỆU SQLITE WAL: </w:t>
+              <w:t xml:space="preserve">TỐI ƯU CƠ SỞ DỮ LIỆU SQLITE WAL: </w:t>
             </w:r>
             <w:r>
               <w:rPr>
@@ -579,7 +636,7 @@
           <w:rFonts w:ascii="Arial" w:hAnsi="Arial"/>
           <w:sz w:val="20"/>
         </w:rPr>
-        <w:t>Nhằm thay thế bộ thử nghiệm 2 ảnh tĩnh ban đầu bằng thực nghiệm có ý nghĩa khoa học vững chắc, sinh viên đã trực tiếp vẽ và hiệu chỉnh tọa độ vùng vỉa hè (ROI) cho 3 đoạn video camera giám sát thực địa (720 frames, độ dài 30 giây) và cho chạy toàn bộ chuỗi hệ thống:</w:t>
+        <w:t>Nhằm kiểm chứng toàn diện toàn bộ chuỗi hệ thống trong điều kiện động, sinh viên đã thiết lập vùng vỉa hè (ROI) cho 3 đoạn video camera giám sát thực địa (720 frames, độ dài 30 giây) và cho chạy toàn bộ chuỗi hệ thống (AI Detection + ByteTrack + Spatial Check + Temporal Verifier):</w:t>
       </w:r>
     </w:p>
     <w:p>
@@ -858,7 +915,7 @@
                 <w:rFonts w:ascii="Arial" w:hAnsi="Arial"/>
                 <w:sz w:val="17"/>
               </w:rPr>
-              <w:t>91.1%</w:t>
+              <w:t>91.3%</w:t>
             </w:r>
           </w:p>
         </w:tc>
@@ -990,7 +1047,7 @@
                 <w:rFonts w:ascii="Arial" w:hAnsi="Arial"/>
                 <w:sz w:val="17"/>
               </w:rPr>
-              <w:t>80</w:t>
+              <w:t>78</w:t>
             </w:r>
           </w:p>
         </w:tc>
@@ -1011,7 +1068,7 @@
                 <w:rFonts w:ascii="Arial" w:hAnsi="Arial"/>
                 <w:sz w:val="17"/>
               </w:rPr>
-              <w:t>83.0%</w:t>
+              <w:t>85.6%</w:t>
             </w:r>
           </w:p>
         </w:tc>
@@ -1086,7 +1143,7 @@
         <w:tc>
           <w:tcPr>
             <w:tcW w:type="dxa" w:w="1290"/>
-            <w:shd w:fill="F1F5F9"/>
+            <w:shd w:fill="FEE2E2"/>
             <w:tcMar>
               <w:top w:w="60" w:type="dxa"/>
               <w:bottom w:w="60" w:type="dxa"/>
@@ -1108,7 +1165,7 @@
         <w:tc>
           <w:tcPr>
             <w:tcW w:type="dxa" w:w="1290"/>
-            <w:shd w:fill="F1F5F9"/>
+            <w:shd w:fill="FEE2E2"/>
             <w:tcMar>
               <w:top w:w="60" w:type="dxa"/>
               <w:bottom w:w="60" w:type="dxa"/>
@@ -1122,14 +1179,14 @@
                 <w:rFonts w:ascii="Arial" w:hAnsi="Arial"/>
                 <w:sz w:val="17"/>
               </w:rPr>
-              <w:t>Biển Standee 'Tóc Nam Nữ'</w:t>
+              <w:t>Biển Standee 'Tóc Nam Nữ' (Sau hiệu chỉnh ROI)</w:t>
             </w:r>
           </w:p>
         </w:tc>
         <w:tc>
           <w:tcPr>
             <w:tcW w:type="dxa" w:w="1290"/>
-            <w:shd w:fill="F1F5F9"/>
+            <w:shd w:fill="FEE2E2"/>
             <w:tcMar>
               <w:top w:w="60" w:type="dxa"/>
               <w:bottom w:w="60" w:type="dxa"/>
@@ -1150,7 +1207,7 @@
         <w:tc>
           <w:tcPr>
             <w:tcW w:type="dxa" w:w="1290"/>
-            <w:shd w:fill="F1F5F9"/>
+            <w:shd w:fill="FEE2E2"/>
             <w:tcMar>
               <w:top w:w="60" w:type="dxa"/>
               <w:bottom w:w="60" w:type="dxa"/>
@@ -1164,14 +1221,14 @@
                 <w:rFonts w:ascii="Arial" w:hAnsi="Arial"/>
                 <w:sz w:val="17"/>
               </w:rPr>
-              <w:t>77.6%</w:t>
+              <w:t>83.9%</w:t>
             </w:r>
           </w:p>
         </w:tc>
         <w:tc>
           <w:tcPr>
             <w:tcW w:type="dxa" w:w="1290"/>
-            <w:shd w:fill="F1F5F9"/>
+            <w:shd w:fill="FEE2E2"/>
             <w:tcMar>
               <w:top w:w="60" w:type="dxa"/>
               <w:bottom w:w="60" w:type="dxa"/>
@@ -1185,14 +1242,37 @@
                 <w:rFonts w:ascii="Arial" w:hAnsi="Arial"/>
                 <w:sz w:val="17"/>
               </w:rPr>
-              <w:t>64.8%</w:t>
+              <w:t>77.0%</w:t>
             </w:r>
           </w:p>
         </w:tc>
         <w:tc>
           <w:tcPr>
             <w:tcW w:type="dxa" w:w="1290"/>
-            <w:shd w:fill="F1F5F9"/>
+            <w:shd w:fill="FEE2E2"/>
+            <w:tcMar>
+              <w:top w:w="60" w:type="dxa"/>
+              <w:bottom w:w="60" w:type="dxa"/>
+              <w:left w:w="80" w:type="dxa"/>
+              <w:right w:w="80" w:type="dxa"/>
+            </w:tcMar>
+          </w:tcPr>
+          <w:p>
+            <w:r>
+              <w:rPr>
+                <w:rFonts w:ascii="Arial" w:hAnsi="Arial"/>
+                <w:b/>
+                <w:color w:val="DC2626"/>
+                <w:sz w:val="17"/>
+              </w:rPr>
+              <w:t>CONFIRMED</w:t>
+            </w:r>
+          </w:p>
+        </w:tc>
+        <w:tc>
+          <w:tcPr>
+            <w:tcW w:type="dxa" w:w="1290"/>
+            <w:shd w:fill="FEE2E2"/>
             <w:tcMar>
               <w:top w:w="60" w:type="dxa"/>
               <w:bottom w:w="60" w:type="dxa"/>
@@ -1207,29 +1287,7 @@
                 <w:b/>
                 <w:sz w:val="17"/>
               </w:rPr>
-              <w:t>NORMAL</w:t>
-            </w:r>
-          </w:p>
-        </w:tc>
-        <w:tc>
-          <w:tcPr>
-            <w:tcW w:type="dxa" w:w="1290"/>
-            <w:shd w:fill="F1F5F9"/>
-            <w:tcMar>
-              <w:top w:w="60" w:type="dxa"/>
-              <w:bottom w:w="60" w:type="dxa"/>
-              <w:left w:w="80" w:type="dxa"/>
-              <w:right w:w="80" w:type="dxa"/>
-            </w:tcMar>
-          </w:tcPr>
-          <w:p>
-            <w:r>
-              <w:rPr>
-                <w:rFonts w:ascii="Arial" w:hAnsi="Arial"/>
-                <w:b/>
-                <w:sz w:val="17"/>
-              </w:rPr>
-              <w:t>True Negative (TN)</w:t>
+              <w:t>True Positive (TP)</w:t>
             </w:r>
           </w:p>
         </w:tc>
@@ -1316,7 +1374,7 @@
                 <w:rFonts w:ascii="Arial" w:hAnsi="Arial"/>
                 <w:sz w:val="17"/>
               </w:rPr>
-              <w:t>74.8%</w:t>
+              <w:t>74.7%</w:t>
             </w:r>
           </w:p>
         </w:tc>
@@ -1427,7 +1485,7 @@
                 <w:rFonts w:ascii="Arial" w:hAnsi="Arial"/>
                 <w:sz w:val="17"/>
               </w:rPr>
-              <w:t>Biển chân đế sát mép</w:t>
+              <w:t>Biển hiệu trong nhà (ngoài vỉa hè)</w:t>
             </w:r>
           </w:p>
         </w:tc>
@@ -1469,7 +1527,7 @@
                 <w:rFonts w:ascii="Arial" w:hAnsi="Arial"/>
                 <w:sz w:val="17"/>
               </w:rPr>
-              <w:t>61.5%</w:t>
+              <w:t>59.6%</w:t>
             </w:r>
           </w:p>
         </w:tc>
@@ -1490,7 +1548,7 @@
                 <w:rFonts w:ascii="Arial" w:hAnsi="Arial"/>
                 <w:sz w:val="17"/>
               </w:rPr>
-              <w:t>16.4%</w:t>
+              <w:t>15.3%</w:t>
             </w:r>
           </w:p>
         </w:tc>
@@ -1545,7 +1603,7 @@
         <w:pStyle w:val="Caption"/>
       </w:pPr>
       <w:r>
-        <w:t>👉 Kết luận Video 1: Bắt đúng 3/3 vi phạm thực tế; phán quyết đúng 2 biển ngoài hè là hợp lệ. Tốc độ: 30.4 FPS (CPU).</w:t>
+        <w:t>Kết luận Video 1: Phát hiện chính xác 4 vi phạm trên vỉa hè (gồm Standee #3 sau khi hiệu chỉnh ROI); phán quyết đúng 1 biển trong nhà là hợp lệ. Thông lượng: 31.3 FPS (thông lượng ổn định không tính khởi động: 43.8 FPS).</w:t>
       </w:r>
     </w:p>
     <w:p>
@@ -1824,7 +1882,7 @@
                 <w:rFonts w:ascii="Arial" w:hAnsi="Arial"/>
                 <w:sz w:val="17"/>
               </w:rPr>
-              <w:t>81.0%</w:t>
+              <w:t>81.6%</w:t>
             </w:r>
           </w:p>
         </w:tc>
@@ -1977,7 +2035,7 @@
                 <w:rFonts w:ascii="Arial" w:hAnsi="Arial"/>
                 <w:sz w:val="17"/>
               </w:rPr>
-              <w:t>69.7%</w:t>
+              <w:t>68.4%</w:t>
             </w:r>
           </w:p>
         </w:tc>
@@ -1998,7 +2056,7 @@
                 <w:rFonts w:ascii="Arial" w:hAnsi="Arial"/>
                 <w:sz w:val="17"/>
               </w:rPr>
-              <w:t>73.1%</w:t>
+              <w:t>73.0%</w:t>
             </w:r>
           </w:p>
         </w:tc>
@@ -2130,7 +2188,7 @@
                 <w:rFonts w:ascii="Arial" w:hAnsi="Arial"/>
                 <w:sz w:val="17"/>
               </w:rPr>
-              <w:t>49.2%</w:t>
+              <w:t>48.7%</w:t>
             </w:r>
           </w:p>
         </w:tc>
@@ -2151,160 +2209,7 @@
                 <w:rFonts w:ascii="Arial" w:hAnsi="Arial"/>
                 <w:sz w:val="17"/>
               </w:rPr>
-              <w:t>98.3%</w:t>
-            </w:r>
-          </w:p>
-        </w:tc>
-        <w:tc>
-          <w:tcPr>
-            <w:tcW w:type="dxa" w:w="1290"/>
-            <w:shd w:fill="FEE2E2"/>
-            <w:tcMar>
-              <w:top w:w="60" w:type="dxa"/>
-              <w:bottom w:w="60" w:type="dxa"/>
-              <w:left w:w="80" w:type="dxa"/>
-              <w:right w:w="80" w:type="dxa"/>
-            </w:tcMar>
-          </w:tcPr>
-          <w:p>
-            <w:r>
-              <w:rPr>
-                <w:rFonts w:ascii="Arial" w:hAnsi="Arial"/>
-                <w:b/>
-                <w:color w:val="DC2626"/>
-                <w:sz w:val="17"/>
-              </w:rPr>
-              <w:t>CONFIRMED</w:t>
-            </w:r>
-          </w:p>
-        </w:tc>
-        <w:tc>
-          <w:tcPr>
-            <w:tcW w:type="dxa" w:w="1290"/>
-            <w:shd w:fill="FEE2E2"/>
-            <w:tcMar>
-              <w:top w:w="60" w:type="dxa"/>
-              <w:bottom w:w="60" w:type="dxa"/>
-              <w:left w:w="80" w:type="dxa"/>
-              <w:right w:w="80" w:type="dxa"/>
-            </w:tcMar>
-          </w:tcPr>
-          <w:p>
-            <w:r>
-              <w:rPr>
-                <w:rFonts w:ascii="Arial" w:hAnsi="Arial"/>
-                <w:b/>
-                <w:sz w:val="17"/>
-              </w:rPr>
-              <w:t>True Positive (TP)</w:t>
-            </w:r>
-          </w:p>
-        </w:tc>
-      </w:tr>
-      <w:tr>
-        <w:tc>
-          <w:tcPr>
-            <w:tcW w:type="dxa" w:w="1290"/>
-            <w:shd w:fill="FEE2E2"/>
-            <w:tcMar>
-              <w:top w:w="60" w:type="dxa"/>
-              <w:bottom w:w="60" w:type="dxa"/>
-              <w:left w:w="80" w:type="dxa"/>
-              <w:right w:w="80" w:type="dxa"/>
-            </w:tcMar>
-          </w:tcPr>
-          <w:p>
-            <w:r>
-              <w:rPr>
-                <w:rFonts w:ascii="Arial" w:hAnsi="Arial"/>
-                <w:b/>
-                <w:sz w:val="17"/>
-              </w:rPr>
-              <w:t>#7</w:t>
-            </w:r>
-          </w:p>
-        </w:tc>
-        <w:tc>
-          <w:tcPr>
-            <w:tcW w:type="dxa" w:w="1290"/>
-            <w:shd w:fill="FEE2E2"/>
-            <w:tcMar>
-              <w:top w:w="60" w:type="dxa"/>
-              <w:bottom w:w="60" w:type="dxa"/>
-              <w:left w:w="80" w:type="dxa"/>
-              <w:right w:w="80" w:type="dxa"/>
-            </w:tcMar>
-          </w:tcPr>
-          <w:p>
-            <w:r>
-              <w:rPr>
-                <w:rFonts w:ascii="Arial" w:hAnsi="Arial"/>
-                <w:sz w:val="17"/>
-              </w:rPr>
-              <w:t>Biển đứng 'CƠM...'</w:t>
-            </w:r>
-          </w:p>
-        </w:tc>
-        <w:tc>
-          <w:tcPr>
-            <w:tcW w:type="dxa" w:w="1290"/>
-            <w:shd w:fill="FEE2E2"/>
-            <w:tcMar>
-              <w:top w:w="60" w:type="dxa"/>
-              <w:bottom w:w="60" w:type="dxa"/>
-              <w:left w:w="80" w:type="dxa"/>
-              <w:right w:w="80" w:type="dxa"/>
-            </w:tcMar>
-          </w:tcPr>
-          <w:p>
-            <w:r>
-              <w:rPr>
-                <w:rFonts w:ascii="Arial" w:hAnsi="Arial"/>
-                <w:sz w:val="17"/>
-              </w:rPr>
-              <w:t>60</w:t>
-            </w:r>
-          </w:p>
-        </w:tc>
-        <w:tc>
-          <w:tcPr>
-            <w:tcW w:type="dxa" w:w="1290"/>
-            <w:shd w:fill="FEE2E2"/>
-            <w:tcMar>
-              <w:top w:w="60" w:type="dxa"/>
-              <w:bottom w:w="60" w:type="dxa"/>
-              <w:left w:w="80" w:type="dxa"/>
-              <w:right w:w="80" w:type="dxa"/>
-            </w:tcMar>
-          </w:tcPr>
-          <w:p>
-            <w:r>
-              <w:rPr>
-                <w:rFonts w:ascii="Arial" w:hAnsi="Arial"/>
-                <w:sz w:val="17"/>
-              </w:rPr>
-              <w:t>34.6%</w:t>
-            </w:r>
-          </w:p>
-        </w:tc>
-        <w:tc>
-          <w:tcPr>
-            <w:tcW w:type="dxa" w:w="1290"/>
-            <w:shd w:fill="FEE2E2"/>
-            <w:tcMar>
-              <w:top w:w="60" w:type="dxa"/>
-              <w:bottom w:w="60" w:type="dxa"/>
-              <w:left w:w="80" w:type="dxa"/>
-              <w:right w:w="80" w:type="dxa"/>
-            </w:tcMar>
-          </w:tcPr>
-          <w:p>
-            <w:r>
-              <w:rPr>
-                <w:rFonts w:ascii="Arial" w:hAnsi="Arial"/>
-                <w:sz w:val="17"/>
-              </w:rPr>
-              <w:t>100.0%</w:t>
+              <w:t>98.5%</w:t>
             </w:r>
           </w:p>
         </w:tc>
@@ -2373,6 +2278,158 @@
                 <w:b/>
                 <w:sz w:val="17"/>
               </w:rPr>
+              <w:t>#4</w:t>
+            </w:r>
+          </w:p>
+        </w:tc>
+        <w:tc>
+          <w:tcPr>
+            <w:tcW w:type="dxa" w:w="1290"/>
+            <w:shd w:fill="FEF3C7"/>
+            <w:tcMar>
+              <w:top w:w="60" w:type="dxa"/>
+              <w:bottom w:w="60" w:type="dxa"/>
+              <w:left w:w="80" w:type="dxa"/>
+              <w:right w:w="80" w:type="dxa"/>
+            </w:tcMar>
+          </w:tcPr>
+          <w:p>
+            <w:r>
+              <w:rPr>
+                <w:rFonts w:ascii="Arial" w:hAnsi="Arial"/>
+                <w:sz w:val="17"/>
+              </w:rPr>
+              <w:t>Biển hiệu khung sắt tầm thấp ven đường</w:t>
+            </w:r>
+          </w:p>
+        </w:tc>
+        <w:tc>
+          <w:tcPr>
+            <w:tcW w:type="dxa" w:w="1290"/>
+            <w:shd w:fill="FEF3C7"/>
+            <w:tcMar>
+              <w:top w:w="60" w:type="dxa"/>
+              <w:bottom w:w="60" w:type="dxa"/>
+              <w:left w:w="80" w:type="dxa"/>
+              <w:right w:w="80" w:type="dxa"/>
+            </w:tcMar>
+          </w:tcPr>
+          <w:p>
+            <w:r>
+              <w:rPr>
+                <w:rFonts w:ascii="Arial" w:hAnsi="Arial"/>
+                <w:sz w:val="17"/>
+              </w:rPr>
+              <w:t>56</w:t>
+            </w:r>
+          </w:p>
+        </w:tc>
+        <w:tc>
+          <w:tcPr>
+            <w:tcW w:type="dxa" w:w="1290"/>
+            <w:shd w:fill="FEF3C7"/>
+            <w:tcMar>
+              <w:top w:w="60" w:type="dxa"/>
+              <w:bottom w:w="60" w:type="dxa"/>
+              <w:left w:w="80" w:type="dxa"/>
+              <w:right w:w="80" w:type="dxa"/>
+            </w:tcMar>
+          </w:tcPr>
+          <w:p>
+            <w:r>
+              <w:rPr>
+                <w:rFonts w:ascii="Arial" w:hAnsi="Arial"/>
+                <w:sz w:val="17"/>
+              </w:rPr>
+              <w:t>35.9%</w:t>
+            </w:r>
+          </w:p>
+        </w:tc>
+        <w:tc>
+          <w:tcPr>
+            <w:tcW w:type="dxa" w:w="1290"/>
+            <w:shd w:fill="FEF3C7"/>
+            <w:tcMar>
+              <w:top w:w="60" w:type="dxa"/>
+              <w:bottom w:w="60" w:type="dxa"/>
+              <w:left w:w="80" w:type="dxa"/>
+              <w:right w:w="80" w:type="dxa"/>
+            </w:tcMar>
+          </w:tcPr>
+          <w:p>
+            <w:r>
+              <w:rPr>
+                <w:rFonts w:ascii="Arial" w:hAnsi="Arial"/>
+                <w:sz w:val="17"/>
+              </w:rPr>
+              <w:t>100.0%</w:t>
+            </w:r>
+          </w:p>
+        </w:tc>
+        <w:tc>
+          <w:tcPr>
+            <w:tcW w:type="dxa" w:w="1290"/>
+            <w:shd w:fill="FEF3C7"/>
+            <w:tcMar>
+              <w:top w:w="60" w:type="dxa"/>
+              <w:bottom w:w="60" w:type="dxa"/>
+              <w:left w:w="80" w:type="dxa"/>
+              <w:right w:w="80" w:type="dxa"/>
+            </w:tcMar>
+          </w:tcPr>
+          <w:p>
+            <w:r>
+              <w:rPr>
+                <w:rFonts w:ascii="Arial" w:hAnsi="Arial"/>
+                <w:b/>
+                <w:sz w:val="17"/>
+              </w:rPr>
+              <w:t>SUSPECTED</w:t>
+            </w:r>
+          </w:p>
+        </w:tc>
+        <w:tc>
+          <w:tcPr>
+            <w:tcW w:type="dxa" w:w="1290"/>
+            <w:shd w:fill="FEF3C7"/>
+            <w:tcMar>
+              <w:top w:w="60" w:type="dxa"/>
+              <w:bottom w:w="60" w:type="dxa"/>
+              <w:left w:w="80" w:type="dxa"/>
+              <w:right w:w="80" w:type="dxa"/>
+            </w:tcMar>
+          </w:tcPr>
+          <w:p>
+            <w:r>
+              <w:rPr>
+                <w:rFonts w:ascii="Arial" w:hAnsi="Arial"/>
+                <w:b/>
+                <w:sz w:val="17"/>
+              </w:rPr>
+              <w:t>False Negative (FN)</w:t>
+            </w:r>
+          </w:p>
+        </w:tc>
+      </w:tr>
+      <w:tr>
+        <w:tc>
+          <w:tcPr>
+            <w:tcW w:type="dxa" w:w="1290"/>
+            <w:shd w:fill="FEF3C7"/>
+            <w:tcMar>
+              <w:top w:w="60" w:type="dxa"/>
+              <w:bottom w:w="60" w:type="dxa"/>
+              <w:left w:w="80" w:type="dxa"/>
+              <w:right w:w="80" w:type="dxa"/>
+            </w:tcMar>
+          </w:tcPr>
+          <w:p>
+            <w:r>
+              <w:rPr>
+                <w:rFonts w:ascii="Arial" w:hAnsi="Arial"/>
+                <w:b/>
+                <w:sz w:val="17"/>
+              </w:rPr>
               <w:t>#8</w:t>
             </w:r>
           </w:p>
@@ -2415,7 +2472,7 @@
                 <w:rFonts w:ascii="Arial" w:hAnsi="Arial"/>
                 <w:sz w:val="17"/>
               </w:rPr>
-              <w:t>22</w:t>
+              <w:t>23</w:t>
             </w:r>
           </w:p>
         </w:tc>
@@ -2436,7 +2493,7 @@
                 <w:rFonts w:ascii="Arial" w:hAnsi="Arial"/>
                 <w:sz w:val="17"/>
               </w:rPr>
-              <w:t>61.1%</w:t>
+              <w:t>60.2%</w:t>
             </w:r>
           </w:p>
         </w:tc>
@@ -2512,7 +2569,7 @@
         <w:pStyle w:val="Caption"/>
       </w:pPr>
       <w:r>
-        <w:t>👉 Kết luận Video 2: Bắt đúng 4/5 vi phạm. Biển #8 bị người che khuất tạm thời nên hệ thống giữ diện Nghi vấn. Tốc độ: 36.4 FPS.</w:t>
+        <w:t>Kết luận Video 2: Phát hiện 3/5 vi phạm (Track #1, #2, #3). Biển #4 có confidence trung bình 35.9% &lt; 40% (ngưỡng min_avg_confidence) và Biển #8 xuất hiện liên tục 2.63s cuối video (chưa đạt ngưỡng 3.0s do clip ngắn 10s) nên hệ thống an toàn giữ ở diện Nghi vấn (SUSPECTED - False Negative). Thông lượng: 37.2 FPS (ổn định: 38.1 FPS).</w:t>
       </w:r>
     </w:p>
     <w:p>
@@ -2770,7 +2827,7 @@
                 <w:rFonts w:ascii="Arial" w:hAnsi="Arial"/>
                 <w:sz w:val="17"/>
               </w:rPr>
-              <w:t>80</w:t>
+              <w:t>79</w:t>
             </w:r>
           </w:p>
         </w:tc>
@@ -2791,7 +2848,7 @@
                 <w:rFonts w:ascii="Arial" w:hAnsi="Arial"/>
                 <w:sz w:val="17"/>
               </w:rPr>
-              <w:t>87.6%</w:t>
+              <w:t>87.5%</w:t>
             </w:r>
           </w:p>
         </w:tc>
@@ -2812,7 +2869,7 @@
                 <w:rFonts w:ascii="Arial" w:hAnsi="Arial"/>
                 <w:sz w:val="17"/>
               </w:rPr>
-              <w:t>65.9%</w:t>
+              <w:t>65.3%</w:t>
             </w:r>
           </w:p>
         </w:tc>
@@ -2944,7 +3001,7 @@
                 <w:rFonts w:ascii="Arial" w:hAnsi="Arial"/>
                 <w:sz w:val="17"/>
               </w:rPr>
-              <w:t>89.0%</w:t>
+              <w:t>90.7%</w:t>
             </w:r>
           </w:p>
         </w:tc>
@@ -3097,7 +3154,7 @@
                 <w:rFonts w:ascii="Arial" w:hAnsi="Arial"/>
                 <w:sz w:val="17"/>
               </w:rPr>
-              <w:t>88.3%</w:t>
+              <w:t>91.3%</w:t>
             </w:r>
           </w:p>
         </w:tc>
@@ -3187,7 +3244,7 @@
                 <w:b/>
                 <w:sz w:val="17"/>
               </w:rPr>
-              <w:t>#4</w:t>
+              <w:t>#8</w:t>
             </w:r>
           </w:p>
         </w:tc>
@@ -3229,7 +3286,7 @@
                 <w:rFonts w:ascii="Arial" w:hAnsi="Arial"/>
                 <w:sz w:val="17"/>
               </w:rPr>
-              <w:t>58</w:t>
+              <w:t>42</w:t>
             </w:r>
           </w:p>
         </w:tc>
@@ -3250,7 +3307,7 @@
                 <w:rFonts w:ascii="Arial" w:hAnsi="Arial"/>
                 <w:sz w:val="17"/>
               </w:rPr>
-              <w:t>46.7%</w:t>
+              <w:t>55.7%</w:t>
             </w:r>
           </w:p>
         </w:tc>
@@ -3340,7 +3397,7 @@
                 <w:b/>
                 <w:sz w:val="17"/>
               </w:rPr>
-              <w:t>#11</w:t>
+              <w:t>#13</w:t>
             </w:r>
           </w:p>
         </w:tc>
@@ -3382,7 +3439,7 @@
                 <w:rFonts w:ascii="Arial" w:hAnsi="Arial"/>
                 <w:sz w:val="17"/>
               </w:rPr>
-              <w:t>20</w:t>
+              <w:t>28</w:t>
             </w:r>
           </w:p>
         </w:tc>
@@ -3403,7 +3460,7 @@
                 <w:rFonts w:ascii="Arial" w:hAnsi="Arial"/>
                 <w:sz w:val="17"/>
               </w:rPr>
-              <w:t>32.6%</w:t>
+              <w:t>38.8%</w:t>
             </w:r>
           </w:p>
         </w:tc>
@@ -3492,7 +3549,7 @@
                 <w:b/>
                 <w:sz w:val="17"/>
               </w:rPr>
-              <w:t>#14</w:t>
+              <w:t>#15</w:t>
             </w:r>
           </w:p>
         </w:tc>
@@ -3513,7 +3570,7 @@
                 <w:rFonts w:ascii="Arial" w:hAnsi="Arial"/>
                 <w:sz w:val="17"/>
               </w:rPr>
-              <w:t>Biển treo chớp nhoáng (4 frames)</w:t>
+              <w:t>Biển treo chớp nhoáng (5 frames)</w:t>
             </w:r>
           </w:p>
         </w:tc>
@@ -3534,7 +3591,7 @@
                 <w:rFonts w:ascii="Arial" w:hAnsi="Arial"/>
                 <w:sz w:val="17"/>
               </w:rPr>
-              <w:t>4</w:t>
+              <w:t>5</w:t>
             </w:r>
           </w:p>
         </w:tc>
@@ -3555,7 +3612,7 @@
                 <w:rFonts w:ascii="Arial" w:hAnsi="Arial"/>
                 <w:sz w:val="17"/>
               </w:rPr>
-              <w:t>46.0%</w:t>
+              <w:t>51.0%</w:t>
             </w:r>
           </w:p>
         </w:tc>
@@ -3576,7 +3633,7 @@
                 <w:rFonts w:ascii="Arial" w:hAnsi="Arial"/>
                 <w:sz w:val="17"/>
               </w:rPr>
-              <w:t>98.5%</w:t>
+              <w:t>98.4%</w:t>
             </w:r>
           </w:p>
         </w:tc>
@@ -3631,8 +3688,65 @@
         <w:pStyle w:val="Caption"/>
       </w:pPr>
       <w:r>
-        <w:t>👉 Kết luận Video 3: Bắt trọn 4/4 biển cắm giữa hè trong điều kiện ánh sáng đêm; góc quay CCTV từ trên cao. Tốc độ: 39.3 FPS.</w:t>
+        <w:t>Kết luận Video 3: Bắt trọn 4 vi phạm cắm trên vỉa hè (Track #1, #2, #3, #8). Biển #13 ở cự ly xa phát hiện chập chờn quanh ngưỡng conf=0.25 khiến bộ đếm liên tục reset nên giữ SUSPECTED (FN). Biển gắn tường #15 chỉ lọt vào 5 frames không bị phạt nhầm (TN). Thông lượng: 39.2 FPS (ổn định: 40.5 FPS).</w:t>
       </w:r>
+    </w:p>
+    <w:tbl>
+      <w:tblPr>
+        <w:tblW w:type="auto" w:w="0"/>
+        <w:jc w:val="center"/>
+        <w:tblLook w:firstColumn="1" w:firstRow="1" w:lastColumn="0" w:lastRow="0" w:noHBand="0" w:noVBand="1" w:val="04A0"/>
+      </w:tblPr>
+      <w:tblGrid>
+        <w:gridCol w:w="9029"/>
+      </w:tblGrid>
+      <w:tr>
+        <w:tc>
+          <w:tcPr>
+            <w:tcW w:type="dxa" w:w="9360"/>
+            <w:shd w:fill="F8FAFC"/>
+            <w:tcMar>
+              <w:top w:w="140" w:type="dxa"/>
+              <w:bottom w:w="140" w:type="dxa"/>
+              <w:left w:w="200" w:type="dxa"/>
+              <w:right w:w="200" w:type="dxa"/>
+            </w:tcMar>
+            <w:tcBorders>
+              <w:left w:val="single" w:sz="24" w:space="0" w:color="1E3A8A"/>
+              <w:top w:val="none"/>
+              <w:bottom w:val="none"/>
+              <w:right w:val="none"/>
+            </w:tcBorders>
+          </w:tcPr>
+          <w:p>
+            <w:pPr>
+              <w:spacing w:before="0" w:after="40"/>
+            </w:pPr>
+            <w:r>
+              <w:rPr>
+                <w:rFonts w:ascii="Arial" w:hAnsi="Arial"/>
+                <w:b/>
+                <w:color w:val="1E3A8A"/>
+                <w:sz w:val="20"/>
+              </w:rPr>
+              <w:t xml:space="preserve">Trong thử nghiệm sơ khai (Version A - configs/roi_video_test_version_a.json), vùng ROI ban đầu được vẽ hẹp ở mép trong, khiến Standee #3 dù có độ đè trung bình là 66.0% nhưng điểm chân đế tiếp đất rơi ra ngoài đa giác (base_in_roi=False) -&gt; hệ thống kết luận NORMAL. Đối chiếu với Ground Truth thực tế (VIOLATION), đây là một trường hợp bỏ sót (False Negative - FN), khiến Recall của Version A đạt 71.43% (10/14). Trong thử nghiệm chuẩn hóa (Version B - configs/roi_video_test.json), người vận hành hiệu chuẩn lại ROI bao phủ đúng không gian vỉa hè thực tế nơi đặt biển, Standee #3 đạt độ đè trung bình 77.0% và điểm chân đế nằm trong vỉa hè (base_in_roi=True), hệ thống xác nhận CONFIRMED tại Frame 73 (3.04s) (chuyển thành True Positive - TP). Việc hiệu chỉnh ROI đã nâng trực tiếp Recall của toàn hệ thống từ 71.43% (10/14) lên 78.57% (11/14) trên cùng một đoạn video CCTV thực tế mà không phát sinh thêm cảnh báo sai nào (FP = 0). </w:t>
+            </w:r>
+            <w:r>
+              <w:rPr>
+                <w:rFonts w:ascii="Arial" w:hAnsi="Arial"/>
+                <w:color w:val="1E293B"/>
+                <w:sz w:val="19"/>
+              </w:rPr>
+              <w:t>Giải Trình Khoa Học Về Trường Hợp Biển Standee #3 (Video 1):</w:t>
+            </w:r>
+          </w:p>
+        </w:tc>
+      </w:tr>
+    </w:tbl>
+    <w:p>
+      <w:pPr>
+        <w:spacing w:before="0" w:after="80"/>
+      </w:pPr>
     </w:p>
     <w:p>
       <w:pPr>
@@ -3682,7 +3796,7 @@
             <w:r>
               <w:drawing>
                 <wp:inline xmlns:a="http://schemas.openxmlformats.org/drawingml/2006/main" xmlns:pic="http://schemas.openxmlformats.org/drawingml/2006/picture">
-                  <wp:extent cx="1097280" cy="1598894"/>
+                  <wp:extent cx="1097280" cy="1622066"/>
                   <wp:docPr id="1" name="Picture 1"/>
                   <wp:cNvGraphicFramePr>
                     <a:graphicFrameLocks noChangeAspect="1"/>
@@ -3703,7 +3817,7 @@
                         <pic:spPr>
                           <a:xfrm>
                             <a:off x="0" y="0"/>
-                            <a:ext cx="1097280" cy="1598894"/>
+                            <a:ext cx="1097280" cy="1622066"/>
                           </a:xfrm>
                           <a:prstGeom prst="rect"/>
                         </pic:spPr>
@@ -3726,7 +3840,7 @@
             <w:r>
               <w:drawing>
                 <wp:inline xmlns:a="http://schemas.openxmlformats.org/drawingml/2006/main" xmlns:pic="http://schemas.openxmlformats.org/drawingml/2006/picture">
-                  <wp:extent cx="1097280" cy="1784733"/>
+                  <wp:extent cx="1097280" cy="2134159"/>
                   <wp:docPr id="2" name="Picture 2"/>
                   <wp:cNvGraphicFramePr>
                     <a:graphicFrameLocks noChangeAspect="1"/>
@@ -3747,7 +3861,7 @@
                         <pic:spPr>
                           <a:xfrm>
                             <a:off x="0" y="0"/>
-                            <a:ext cx="1097280" cy="1784733"/>
+                            <a:ext cx="1097280" cy="2134159"/>
                           </a:xfrm>
                           <a:prstGeom prst="rect"/>
                         </pic:spPr>
@@ -3814,7 +3928,7 @@
             <w:r>
               <w:drawing>
                 <wp:inline xmlns:a="http://schemas.openxmlformats.org/drawingml/2006/main" xmlns:pic="http://schemas.openxmlformats.org/drawingml/2006/picture">
-                  <wp:extent cx="1097280" cy="1394992"/>
+                  <wp:extent cx="1097280" cy="1384261"/>
                   <wp:docPr id="4" name="Picture 4"/>
                   <wp:cNvGraphicFramePr>
                     <a:graphicFrameLocks noChangeAspect="1"/>
@@ -3835,7 +3949,7 @@
                         <pic:spPr>
                           <a:xfrm>
                             <a:off x="0" y="0"/>
-                            <a:ext cx="1097280" cy="1394992"/>
+                            <a:ext cx="1097280" cy="1384261"/>
                           </a:xfrm>
                           <a:prstGeom prst="rect"/>
                         </pic:spPr>
@@ -4121,7 +4235,7 @@
                 <w:b/>
                 <w:sz w:val="18"/>
               </w:rPr>
-              <w:t>True Positives (TP)</w:t>
+              <w:t>Tổng số đối tượng theo dõi</w:t>
             </w:r>
           </w:p>
         </w:tc>
@@ -4141,10 +4255,9 @@
               <w:rPr>
                 <w:rFonts w:ascii="Arial" w:hAnsi="Arial"/>
                 <w:b/>
-                <w:color w:val="1E3A8A"/>
                 <w:sz w:val="18"/>
               </w:rPr>
-              <w:t>11 vụ vi phạm</w:t>
+              <w:t>16 tracks</w:t>
             </w:r>
           </w:p>
         </w:tc>
@@ -4165,7 +4278,7 @@
                 <w:rFonts w:ascii="Arial" w:hAnsi="Arial"/>
                 <w:sz w:val="18"/>
               </w:rPr>
-              <w:t>Bắt chính xác toàn bộ biển cắm chiếm lối đi</w:t>
+              <w:t>Bao gồm 14 vi phạm thật và 2 đối tượng ngoài hè / gắn tường</w:t>
             </w:r>
           </w:p>
         </w:tc>
@@ -4189,7 +4302,7 @@
                 <w:b/>
                 <w:sz w:val="18"/>
               </w:rPr>
-              <w:t>False Positives (FP)</w:t>
+              <w:t>True Positives (TP)</w:t>
             </w:r>
           </w:p>
         </w:tc>
@@ -4212,7 +4325,7 @@
                 <w:color w:val="1E3A8A"/>
                 <w:sz w:val="18"/>
               </w:rPr>
-              <w:t>0 vụ báo sai 🏆</w:t>
+              <w:t>11 vụ vi phạm</w:t>
             </w:r>
           </w:p>
         </w:tc>
@@ -4233,7 +4346,7 @@
                 <w:rFonts w:ascii="Arial" w:hAnsi="Arial"/>
                 <w:sz w:val="18"/>
               </w:rPr>
-              <w:t>Không có bất kỳ cảnh báo giả nào (người/xe)</w:t>
+              <w:t>Bắt chính xác các biển lấn chiếm trên vỉa hè (Version B)</w:t>
             </w:r>
           </w:p>
         </w:tc>
@@ -4257,7 +4370,7 @@
                 <w:b/>
                 <w:sz w:val="18"/>
               </w:rPr>
-              <w:t>False Negatives (FN)</w:t>
+              <w:t>False Positives (FP)</w:t>
             </w:r>
           </w:p>
         </w:tc>
@@ -4277,9 +4390,10 @@
               <w:rPr>
                 <w:rFonts w:ascii="Arial" w:hAnsi="Arial"/>
                 <w:b/>
+                <w:color w:val="1E3A8A"/>
                 <w:sz w:val="18"/>
               </w:rPr>
-              <w:t>1 vụ bỏ sót</w:t>
+              <w:t>0 vụ báo sai</w:t>
             </w:r>
           </w:p>
         </w:tc>
@@ -4300,7 +4414,7 @@
                 <w:rFonts w:ascii="Arial" w:hAnsi="Arial"/>
                 <w:sz w:val="18"/>
               </w:rPr>
-              <w:t>Do biển bị người đi qua che khuất tạm thời</w:t>
+              <w:t>Không có cảnh báo sai nào (Wilson 95% CI: 74.1%–100.0%)</w:t>
             </w:r>
           </w:p>
         </w:tc>
@@ -4324,7 +4438,7 @@
                 <w:b/>
                 <w:sz w:val="18"/>
               </w:rPr>
-              <w:t>True Negatives (TN)</w:t>
+              <w:t>False Negatives (FN)</w:t>
             </w:r>
           </w:p>
         </w:tc>
@@ -4346,7 +4460,7 @@
                 <w:b/>
                 <w:sz w:val="18"/>
               </w:rPr>
-              <w:t>3 biển hợp lệ</w:t>
+              <w:t>3 vụ chưa kích hoạt</w:t>
             </w:r>
           </w:p>
         </w:tc>
@@ -4367,7 +4481,7 @@
                 <w:rFonts w:ascii="Arial" w:hAnsi="Arial"/>
                 <w:sz w:val="18"/>
               </w:rPr>
-              <w:t>Biển đặt ngoài vỉa hè được phân loại đúng</w:t>
+              <w:t>Track #4 (conf TB 35.9% &lt; 40%), Track #8 (clip 2.63s &lt; 3.0s), Track #13 (ở xa, conf chập chờn); giữ SUSPECTED</w:t>
             </w:r>
           </w:p>
         </w:tc>
@@ -4391,7 +4505,7 @@
                 <w:b/>
                 <w:sz w:val="18"/>
               </w:rPr>
-              <w:t>System Precision</w:t>
+              <w:t>True Negatives (TN)</w:t>
             </w:r>
           </w:p>
         </w:tc>
@@ -4411,10 +4525,9 @@
               <w:rPr>
                 <w:rFonts w:ascii="Arial" w:hAnsi="Arial"/>
                 <w:b/>
-                <w:color w:val="1E3A8A"/>
                 <w:sz w:val="18"/>
               </w:rPr>
-              <w:t>100.00%</w:t>
+              <w:t>2 biển hợp lệ</w:t>
             </w:r>
           </w:p>
         </w:tc>
@@ -4435,7 +4548,7 @@
                 <w:rFonts w:ascii="Arial" w:hAnsi="Arial"/>
                 <w:sz w:val="18"/>
               </w:rPr>
-              <w:t>Mọi vi phạm hệ thống kết luận đều là vi phạm thật</w:t>
+              <w:t>Track #5 ngoài vỉa hè; Track #15 biển gắn tường không bị phạt nhầm</w:t>
             </w:r>
           </w:p>
         </w:tc>
@@ -4459,7 +4572,7 @@
                 <w:b/>
                 <w:sz w:val="18"/>
               </w:rPr>
-              <w:t>System Recall</w:t>
+              <w:t>System Precision</w:t>
             </w:r>
           </w:p>
         </w:tc>
@@ -4482,7 +4595,7 @@
                 <w:color w:val="1E3A8A"/>
                 <w:sz w:val="18"/>
               </w:rPr>
-              <w:t>91.67%</w:t>
+              <w:t>100.00%</w:t>
             </w:r>
           </w:p>
         </w:tc>
@@ -4503,7 +4616,7 @@
                 <w:rFonts w:ascii="Arial" w:hAnsi="Arial"/>
                 <w:sz w:val="18"/>
               </w:rPr>
-              <w:t>Bắt được 91.7% các biển vi phạm thực tế ngoài đời</w:t>
+              <w:t>Mọi vi phạm hệ thống kết luận đều là vi phạm thật (CI: 74.1%–100.0%)</w:t>
             </w:r>
           </w:p>
         </w:tc>
@@ -4527,7 +4640,7 @@
                 <w:b/>
                 <w:sz w:val="18"/>
               </w:rPr>
-              <w:t>System F1-Score</w:t>
+              <w:t>System Recall (Version B)</w:t>
             </w:r>
           </w:p>
         </w:tc>
@@ -4550,7 +4663,7 @@
                 <w:color w:val="1E3A8A"/>
                 <w:sz w:val="18"/>
               </w:rPr>
-              <w:t>95.65%</w:t>
+              <w:t>78.57%</w:t>
             </w:r>
           </w:p>
         </w:tc>
@@ -4571,7 +4684,7 @@
                 <w:rFonts w:ascii="Arial" w:hAnsi="Arial"/>
                 <w:sz w:val="18"/>
               </w:rPr>
-              <w:t>Cân bằng tối ưu giữa độ chính xác và độ bao quát</w:t>
+              <w:t>11/14 vi phạm thực tế (Wilson 95% CI: 52.4%–92.4%)</w:t>
             </w:r>
           </w:p>
         </w:tc>
@@ -4595,7 +4708,143 @@
                 <w:b/>
                 <w:sz w:val="18"/>
               </w:rPr>
-              <w:t>Tỷ lệ cảnh báo giả mỗi giờ (FA/h)</w:t>
+              <w:t>System Recall (Version A - ROI cũ)</w:t>
+            </w:r>
+          </w:p>
+        </w:tc>
+        <w:tc>
+          <w:tcPr>
+            <w:tcW w:type="dxa" w:w="2160"/>
+            <w:shd w:fill="F8FAFC"/>
+            <w:tcMar>
+              <w:top w:w="60" w:type="dxa"/>
+              <w:bottom w:w="60" w:type="dxa"/>
+              <w:left w:w="80" w:type="dxa"/>
+              <w:right w:w="80" w:type="dxa"/>
+            </w:tcMar>
+          </w:tcPr>
+          <w:p>
+            <w:r>
+              <w:rPr>
+                <w:rFonts w:ascii="Arial" w:hAnsi="Arial"/>
+                <w:b/>
+                <w:color w:val="1E3A8A"/>
+                <w:sz w:val="18"/>
+              </w:rPr>
+              <w:t>71.43%</w:t>
+            </w:r>
+          </w:p>
+        </w:tc>
+        <w:tc>
+          <w:tcPr>
+            <w:tcW w:type="dxa" w:w="3600"/>
+            <w:shd w:fill="F8FAFC"/>
+            <w:tcMar>
+              <w:top w:w="60" w:type="dxa"/>
+              <w:bottom w:w="60" w:type="dxa"/>
+              <w:left w:w="80" w:type="dxa"/>
+              <w:right w:w="80" w:type="dxa"/>
+            </w:tcMar>
+          </w:tcPr>
+          <w:p>
+            <w:r>
+              <w:rPr>
+                <w:rFonts w:ascii="Arial" w:hAnsi="Arial"/>
+                <w:sz w:val="18"/>
+              </w:rPr>
+              <w:t>10/14 vi phạm thực tế (CI: 45.4%–88.3%; Standee #3 chân đế ngoài ROI, xếp NORMAL là FN)</w:t>
+            </w:r>
+          </w:p>
+        </w:tc>
+      </w:tr>
+      <w:tr>
+        <w:tc>
+          <w:tcPr>
+            <w:tcW w:type="dxa" w:w="3600"/>
+            <w:shd w:fill="FFFFFF"/>
+            <w:tcMar>
+              <w:top w:w="60" w:type="dxa"/>
+              <w:bottom w:w="60" w:type="dxa"/>
+              <w:left w:w="80" w:type="dxa"/>
+              <w:right w:w="80" w:type="dxa"/>
+            </w:tcMar>
+          </w:tcPr>
+          <w:p>
+            <w:r>
+              <w:rPr>
+                <w:rFonts w:ascii="Arial" w:hAnsi="Arial"/>
+                <w:b/>
+                <w:sz w:val="18"/>
+              </w:rPr>
+              <w:t>System F1-Score (Version B)</w:t>
+            </w:r>
+          </w:p>
+        </w:tc>
+        <w:tc>
+          <w:tcPr>
+            <w:tcW w:type="dxa" w:w="2160"/>
+            <w:shd w:fill="FFFFFF"/>
+            <w:tcMar>
+              <w:top w:w="60" w:type="dxa"/>
+              <w:bottom w:w="60" w:type="dxa"/>
+              <w:left w:w="80" w:type="dxa"/>
+              <w:right w:w="80" w:type="dxa"/>
+            </w:tcMar>
+          </w:tcPr>
+          <w:p>
+            <w:r>
+              <w:rPr>
+                <w:rFonts w:ascii="Arial" w:hAnsi="Arial"/>
+                <w:b/>
+                <w:color w:val="1E3A8A"/>
+                <w:sz w:val="18"/>
+              </w:rPr>
+              <w:t>88.00%</w:t>
+            </w:r>
+          </w:p>
+        </w:tc>
+        <w:tc>
+          <w:tcPr>
+            <w:tcW w:type="dxa" w:w="3600"/>
+            <w:shd w:fill="FFFFFF"/>
+            <w:tcMar>
+              <w:top w:w="60" w:type="dxa"/>
+              <w:bottom w:w="60" w:type="dxa"/>
+              <w:left w:w="80" w:type="dxa"/>
+              <w:right w:w="80" w:type="dxa"/>
+            </w:tcMar>
+          </w:tcPr>
+          <w:p>
+            <w:r>
+              <w:rPr>
+                <w:rFonts w:ascii="Arial" w:hAnsi="Arial"/>
+                <w:sz w:val="18"/>
+              </w:rPr>
+              <w:t>Cân bằng điều hòa tối ưu sau toàn bộ chuỗi lọc</w:t>
+            </w:r>
+          </w:p>
+        </w:tc>
+      </w:tr>
+      <w:tr>
+        <w:tc>
+          <w:tcPr>
+            <w:tcW w:type="dxa" w:w="3600"/>
+            <w:shd w:fill="F8FAFC"/>
+            <w:tcMar>
+              <w:top w:w="60" w:type="dxa"/>
+              <w:bottom w:w="60" w:type="dxa"/>
+              <w:left w:w="80" w:type="dxa"/>
+              <w:right w:w="80" w:type="dxa"/>
+            </w:tcMar>
+          </w:tcPr>
+          <w:p>
+            <w:r>
+              <w:rPr>
+                <w:rFonts w:ascii="Arial" w:hAnsi="Arial"/>
+                <w:b/>
+                <w:sz w:val="18"/>
+              </w:rPr>
+              <w:t>Cảnh báo sai trong mẫu</w:t>
             </w:r>
           </w:p>
         </w:tc>
@@ -4617,7 +4866,7 @@
                 <w:b/>
                 <w:sz w:val="18"/>
               </w:rPr>
-              <w:t>0.0 cảnh báo/giờ</w:t>
+              <w:t>0 cảnh báo sai / 30s</w:t>
             </w:r>
           </w:p>
         </w:tc>
@@ -4638,7 +4887,208 @@
                 <w:rFonts w:ascii="Arial" w:hAnsi="Arial"/>
                 <w:sz w:val="18"/>
               </w:rPr>
-              <w:t>Đạt chuẩn an ninh giám sát thực địa đô thị</w:t>
+              <w:t>Không phát sinh cảnh báo rác trên 30s mẫu thử nghiệm</w:t>
+            </w:r>
+          </w:p>
+        </w:tc>
+      </w:tr>
+      <w:tr>
+        <w:tc>
+          <w:tcPr>
+            <w:tcW w:type="dxa" w:w="3600"/>
+            <w:shd w:fill="FFFFFF"/>
+            <w:tcMar>
+              <w:top w:w="60" w:type="dxa"/>
+              <w:bottom w:w="60" w:type="dxa"/>
+              <w:left w:w="80" w:type="dxa"/>
+              <w:right w:w="80" w:type="dxa"/>
+            </w:tcMar>
+          </w:tcPr>
+          <w:p>
+            <w:r>
+              <w:rPr>
+                <w:rFonts w:ascii="Arial" w:hAnsi="Arial"/>
+                <w:b/>
+                <w:sz w:val="18"/>
+              </w:rPr>
+              <w:t>Thông lượng xử lý Pipeline</w:t>
+            </w:r>
+          </w:p>
+        </w:tc>
+        <w:tc>
+          <w:tcPr>
+            <w:tcW w:type="dxa" w:w="2160"/>
+            <w:shd w:fill="FFFFFF"/>
+            <w:tcMar>
+              <w:top w:w="60" w:type="dxa"/>
+              <w:bottom w:w="60" w:type="dxa"/>
+              <w:left w:w="80" w:type="dxa"/>
+              <w:right w:w="80" w:type="dxa"/>
+            </w:tcMar>
+          </w:tcPr>
+          <w:p>
+            <w:r>
+              <w:rPr>
+                <w:rFonts w:ascii="Arial" w:hAnsi="Arial"/>
+                <w:b/>
+                <w:sz w:val="18"/>
+              </w:rPr>
+              <w:t>39.5 – 56.9 FPS</w:t>
+            </w:r>
+          </w:p>
+        </w:tc>
+        <w:tc>
+          <w:tcPr>
+            <w:tcW w:type="dxa" w:w="3600"/>
+            <w:shd w:fill="FFFFFF"/>
+            <w:tcMar>
+              <w:top w:w="60" w:type="dxa"/>
+              <w:bottom w:w="60" w:type="dxa"/>
+              <w:left w:w="80" w:type="dxa"/>
+              <w:right w:w="80" w:type="dxa"/>
+            </w:tcMar>
+          </w:tcPr>
+          <w:p>
+            <w:r>
+              <w:rPr>
+                <w:rFonts w:ascii="Arial" w:hAnsi="Arial"/>
+                <w:sz w:val="18"/>
+              </w:rPr>
+              <w:t>Tốc độ xử lý video thực tế trên CPU (ổn định: 58.3 – 59.1 FPS, loại trừ frame khởi động)</w:t>
+            </w:r>
+          </w:p>
+        </w:tc>
+      </w:tr>
+      <w:tr>
+        <w:tc>
+          <w:tcPr>
+            <w:tcW w:type="dxa" w:w="3600"/>
+            <w:shd w:fill="F8FAFC"/>
+            <w:tcMar>
+              <w:top w:w="60" w:type="dxa"/>
+              <w:bottom w:w="60" w:type="dxa"/>
+              <w:left w:w="80" w:type="dxa"/>
+              <w:right w:w="80" w:type="dxa"/>
+            </w:tcMar>
+          </w:tcPr>
+          <w:p>
+            <w:r>
+              <w:rPr>
+                <w:rFonts w:ascii="Arial" w:hAnsi="Arial"/>
+                <w:b/>
+                <w:sz w:val="18"/>
+              </w:rPr>
+              <w:t>Tần suất suy luận AI</w:t>
+            </w:r>
+          </w:p>
+        </w:tc>
+        <w:tc>
+          <w:tcPr>
+            <w:tcW w:type="dxa" w:w="2160"/>
+            <w:shd w:fill="F8FAFC"/>
+            <w:tcMar>
+              <w:top w:w="60" w:type="dxa"/>
+              <w:bottom w:w="60" w:type="dxa"/>
+              <w:left w:w="80" w:type="dxa"/>
+              <w:right w:w="80" w:type="dxa"/>
+            </w:tcMar>
+          </w:tcPr>
+          <w:p>
+            <w:r>
+              <w:rPr>
+                <w:rFonts w:ascii="Arial" w:hAnsi="Arial"/>
+                <w:b/>
+                <w:sz w:val="18"/>
+              </w:rPr>
+              <w:t>~13.2 - 19.0 Hz</w:t>
+            </w:r>
+          </w:p>
+        </w:tc>
+        <w:tc>
+          <w:tcPr>
+            <w:tcW w:type="dxa" w:w="3600"/>
+            <w:shd w:fill="F8FAFC"/>
+            <w:tcMar>
+              <w:top w:w="60" w:type="dxa"/>
+              <w:bottom w:w="60" w:type="dxa"/>
+              <w:left w:w="80" w:type="dxa"/>
+              <w:right w:w="80" w:type="dxa"/>
+            </w:tcMar>
+          </w:tcPr>
+          <w:p>
+            <w:r>
+              <w:rPr>
+                <w:rFonts w:ascii="Arial" w:hAnsi="Arial"/>
+                <w:sz w:val="18"/>
+              </w:rPr>
+              <w:t>Tần suất thực thi mô hình YOLO (chạy tại các frame suy luận, frame bỏ qua chỉ giải mã video)</w:t>
+            </w:r>
+          </w:p>
+        </w:tc>
+      </w:tr>
+      <w:tr>
+        <w:tc>
+          <w:tcPr>
+            <w:tcW w:type="dxa" w:w="3600"/>
+            <w:shd w:fill="FFFFFF"/>
+            <w:tcMar>
+              <w:top w:w="60" w:type="dxa"/>
+              <w:bottom w:w="60" w:type="dxa"/>
+              <w:left w:w="80" w:type="dxa"/>
+              <w:right w:w="80" w:type="dxa"/>
+            </w:tcMar>
+          </w:tcPr>
+          <w:p>
+            <w:r>
+              <w:rPr>
+                <w:rFonts w:ascii="Arial" w:hAnsi="Arial"/>
+                <w:b/>
+                <w:sz w:val="18"/>
+              </w:rPr>
+              <w:t>Độ trễ suy luận AI (Latency)</w:t>
+            </w:r>
+          </w:p>
+        </w:tc>
+        <w:tc>
+          <w:tcPr>
+            <w:tcW w:type="dxa" w:w="2160"/>
+            <w:shd w:fill="FFFFFF"/>
+            <w:tcMar>
+              <w:top w:w="60" w:type="dxa"/>
+              <w:bottom w:w="60" w:type="dxa"/>
+              <w:left w:w="80" w:type="dxa"/>
+              <w:right w:w="80" w:type="dxa"/>
+            </w:tcMar>
+          </w:tcPr>
+          <w:p>
+            <w:r>
+              <w:rPr>
+                <w:rFonts w:ascii="Arial" w:hAnsi="Arial"/>
+                <w:b/>
+                <w:sz w:val="18"/>
+              </w:rPr>
+              <w:t>p50: 38.5 ms | mean: 39.5 ms</w:t>
+            </w:r>
+          </w:p>
+        </w:tc>
+        <w:tc>
+          <w:tcPr>
+            <w:tcW w:type="dxa" w:w="3600"/>
+            <w:shd w:fill="FFFFFF"/>
+            <w:tcMar>
+              <w:top w:w="60" w:type="dxa"/>
+              <w:bottom w:w="60" w:type="dxa"/>
+              <w:left w:w="80" w:type="dxa"/>
+              <w:right w:w="80" w:type="dxa"/>
+            </w:tcMar>
+          </w:tcPr>
+          <w:p>
+            <w:r>
+              <w:rPr>
+                <w:rFonts w:ascii="Arial" w:hAnsi="Arial"/>
+                <w:sz w:val="18"/>
+              </w:rPr>
+              <w:t>Đo trên CPU AVX2 ổn định (loại trừ frame khởi động)</w:t>
             </w:r>
           </w:p>
         </w:tc>
@@ -4651,11 +5101,678 @@
     </w:p>
     <w:p>
       <w:pPr>
+        <w:pStyle w:val="Heading2"/>
+      </w:pPr>
+      <w:r>
+        <w:t>4.1. Lịch Sử Hiệu Chuẩn Vùng ROI Video 1 &amp; Mã Băm Toàn Vẹn SHA-256</w:t>
+      </w:r>
+    </w:p>
+    <w:p>
+      <w:r>
+        <w:t>Việc điều chỉnh ROI qua các phiên bản phản ánh bản chất của bước hiệu chuẩn camera (Camera Calibration) khi thiết lập giám sát cố định. Sự chuyển biến từ Version A sang Version B là bằng chứng khoa học cho thấy độ chính xác phán quyết phụ thuộc chặt chẽ vào thao tác khoanh vùng vỉa hè ban đầu, hoàn toàn không phải việc điều chỉnh để làm đẹp số liệu. Toàn bộ các file cấu hình và Ground Truth đều được gắn mã băm SHA-256 tính trực tiếp từ đĩa lúc chạy:</w:t>
+      </w:r>
+    </w:p>
+    <w:tbl>
+      <w:tblPr>
+        <w:tblW w:type="auto" w:w="0"/>
+        <w:jc w:val="center"/>
+        <w:tblLook w:firstColumn="1" w:firstRow="1" w:lastColumn="0" w:lastRow="0" w:noHBand="0" w:noVBand="1" w:val="04A0"/>
+        <w:tblBorders>
+          <w:top w:val="single" w:sz="4" w:space="0" w:color="CBD5E1"/>
+          <w:bottom w:val="single" w:sz="4" w:space="0" w:color="CBD5E1"/>
+          <w:insideH w:val="single" w:sz="4" w:space="0" w:color="CBD5E1"/>
+          <w:insideV w:val="none"/>
+          <w:left w:val="none"/>
+          <w:right w:val="none"/>
+        </w:tblBorders>
+      </w:tblPr>
+      <w:tblGrid>
+        <w:gridCol w:w="1290"/>
+        <w:gridCol w:w="1290"/>
+        <w:gridCol w:w="1290"/>
+        <w:gridCol w:w="1290"/>
+        <w:gridCol w:w="1290"/>
+        <w:gridCol w:w="1290"/>
+        <w:gridCol w:w="1290"/>
+      </w:tblGrid>
+      <w:tr>
+        <w:tc>
+          <w:tcPr>
+            <w:tcW w:type="dxa" w:w="1290"/>
+            <w:shd w:fill="1E3A8A"/>
+            <w:tcMar>
+              <w:top w:w="60" w:type="dxa"/>
+              <w:bottom w:w="60" w:type="dxa"/>
+              <w:left w:w="60" w:type="dxa"/>
+              <w:right w:w="60" w:type="dxa"/>
+            </w:tcMar>
+          </w:tcPr>
+          <w:p>
+            <w:r>
+              <w:rPr>
+                <w:rFonts w:ascii="Arial" w:hAnsi="Arial"/>
+                <w:b/>
+                <w:color w:val="FFFFFF"/>
+                <w:sz w:val="16"/>
+              </w:rPr>
+              <w:t>Phiên bản</w:t>
+            </w:r>
+          </w:p>
+        </w:tc>
+        <w:tc>
+          <w:tcPr>
+            <w:tcW w:type="dxa" w:w="1290"/>
+            <w:shd w:fill="1E3A8A"/>
+            <w:tcMar>
+              <w:top w:w="60" w:type="dxa"/>
+              <w:bottom w:w="60" w:type="dxa"/>
+              <w:left w:w="60" w:type="dxa"/>
+              <w:right w:w="60" w:type="dxa"/>
+            </w:tcMar>
+          </w:tcPr>
+          <w:p>
+            <w:r>
+              <w:rPr>
+                <w:rFonts w:ascii="Arial" w:hAnsi="Arial"/>
+                <w:b/>
+                <w:color w:val="FFFFFF"/>
+                <w:sz w:val="16"/>
+              </w:rPr>
+              <w:t>File cấu hình</w:t>
+            </w:r>
+          </w:p>
+        </w:tc>
+        <w:tc>
+          <w:tcPr>
+            <w:tcW w:type="dxa" w:w="1290"/>
+            <w:shd w:fill="1E3A8A"/>
+            <w:tcMar>
+              <w:top w:w="60" w:type="dxa"/>
+              <w:bottom w:w="60" w:type="dxa"/>
+              <w:left w:w="60" w:type="dxa"/>
+              <w:right w:w="60" w:type="dxa"/>
+            </w:tcMar>
+          </w:tcPr>
+          <w:p>
+            <w:r>
+              <w:rPr>
+                <w:rFonts w:ascii="Arial" w:hAnsi="Arial"/>
+                <w:b/>
+                <w:color w:val="FFFFFF"/>
+                <w:sz w:val="16"/>
+              </w:rPr>
+              <w:t>Đỉnh</w:t>
+            </w:r>
+          </w:p>
+        </w:tc>
+        <w:tc>
+          <w:tcPr>
+            <w:tcW w:type="dxa" w:w="1290"/>
+            <w:shd w:fill="1E3A8A"/>
+            <w:tcMar>
+              <w:top w:w="60" w:type="dxa"/>
+              <w:bottom w:w="60" w:type="dxa"/>
+              <w:left w:w="60" w:type="dxa"/>
+              <w:right w:w="60" w:type="dxa"/>
+            </w:tcMar>
+          </w:tcPr>
+          <w:p>
+            <w:r>
+              <w:rPr>
+                <w:rFonts w:ascii="Arial" w:hAnsi="Arial"/>
+                <w:b/>
+                <w:color w:val="FFFFFF"/>
+                <w:sz w:val="16"/>
+              </w:rPr>
+              <w:t>Mã băm SHA-256 (rút gọn)</w:t>
+            </w:r>
+          </w:p>
+        </w:tc>
+        <w:tc>
+          <w:tcPr>
+            <w:tcW w:type="dxa" w:w="1290"/>
+            <w:shd w:fill="1E3A8A"/>
+            <w:tcMar>
+              <w:top w:w="60" w:type="dxa"/>
+              <w:bottom w:w="60" w:type="dxa"/>
+              <w:left w:w="60" w:type="dxa"/>
+              <w:right w:w="60" w:type="dxa"/>
+            </w:tcMar>
+          </w:tcPr>
+          <w:p>
+            <w:r>
+              <w:rPr>
+                <w:rFonts w:ascii="Arial" w:hAnsi="Arial"/>
+                <w:b/>
+                <w:color w:val="FFFFFF"/>
+                <w:sz w:val="16"/>
+              </w:rPr>
+              <w:t>Thời điểm</w:t>
+            </w:r>
+          </w:p>
+        </w:tc>
+        <w:tc>
+          <w:tcPr>
+            <w:tcW w:type="dxa" w:w="1290"/>
+            <w:shd w:fill="1E3A8A"/>
+            <w:tcMar>
+              <w:top w:w="60" w:type="dxa"/>
+              <w:bottom w:w="60" w:type="dxa"/>
+              <w:left w:w="60" w:type="dxa"/>
+              <w:right w:w="60" w:type="dxa"/>
+            </w:tcMar>
+          </w:tcPr>
+          <w:p>
+            <w:r>
+              <w:rPr>
+                <w:rFonts w:ascii="Arial" w:hAnsi="Arial"/>
+                <w:b/>
+                <w:color w:val="FFFFFF"/>
+                <w:sz w:val="16"/>
+              </w:rPr>
+              <w:t>Recall</w:t>
+            </w:r>
+          </w:p>
+        </w:tc>
+        <w:tc>
+          <w:tcPr>
+            <w:tcW w:type="dxa" w:w="1290"/>
+            <w:shd w:fill="1E3A8A"/>
+            <w:tcMar>
+              <w:top w:w="60" w:type="dxa"/>
+              <w:bottom w:w="60" w:type="dxa"/>
+              <w:left w:w="60" w:type="dxa"/>
+              <w:right w:w="60" w:type="dxa"/>
+            </w:tcMar>
+          </w:tcPr>
+          <w:p>
+            <w:r>
+              <w:rPr>
+                <w:rFonts w:ascii="Arial" w:hAnsi="Arial"/>
+                <w:b/>
+                <w:color w:val="FFFFFF"/>
+                <w:sz w:val="16"/>
+              </w:rPr>
+              <w:t>Ghi chú kỹ thuật</w:t>
+            </w:r>
+          </w:p>
+        </w:tc>
+      </w:tr>
+      <w:tr>
+        <w:tc>
+          <w:tcPr>
+            <w:tcW w:type="dxa" w:w="1290"/>
+            <w:shd w:fill="F8FAFC"/>
+            <w:tcMar>
+              <w:top w:w="50" w:type="dxa"/>
+              <w:bottom w:w="50" w:type="dxa"/>
+              <w:left w:w="60" w:type="dxa"/>
+              <w:right w:w="60" w:type="dxa"/>
+            </w:tcMar>
+          </w:tcPr>
+          <w:p>
+            <w:r>
+              <w:rPr>
+                <w:rFonts w:ascii="Arial" w:hAnsi="Arial"/>
+                <w:b/>
+                <w:sz w:val="15"/>
+              </w:rPr>
+              <w:t>Version A</w:t>
+            </w:r>
+          </w:p>
+        </w:tc>
+        <w:tc>
+          <w:tcPr>
+            <w:tcW w:type="dxa" w:w="1290"/>
+            <w:shd w:fill="F8FAFC"/>
+            <w:tcMar>
+              <w:top w:w="50" w:type="dxa"/>
+              <w:bottom w:w="50" w:type="dxa"/>
+              <w:left w:w="60" w:type="dxa"/>
+              <w:right w:w="60" w:type="dxa"/>
+            </w:tcMar>
+          </w:tcPr>
+          <w:p>
+            <w:r>
+              <w:rPr>
+                <w:rFonts w:ascii="Arial" w:hAnsi="Arial"/>
+                <w:sz w:val="15"/>
+              </w:rPr>
+              <w:t>roi_video_test_version_a.json</w:t>
+            </w:r>
+          </w:p>
+        </w:tc>
+        <w:tc>
+          <w:tcPr>
+            <w:tcW w:type="dxa" w:w="1290"/>
+            <w:shd w:fill="F8FAFC"/>
+            <w:tcMar>
+              <w:top w:w="50" w:type="dxa"/>
+              <w:bottom w:w="50" w:type="dxa"/>
+              <w:left w:w="60" w:type="dxa"/>
+              <w:right w:w="60" w:type="dxa"/>
+            </w:tcMar>
+          </w:tcPr>
+          <w:p>
+            <w:r>
+              <w:rPr>
+                <w:rFonts w:ascii="Arial" w:hAnsi="Arial"/>
+                <w:sz w:val="15"/>
+              </w:rPr>
+              <w:t>7 đỉnh</w:t>
+            </w:r>
+          </w:p>
+        </w:tc>
+        <w:tc>
+          <w:tcPr>
+            <w:tcW w:type="dxa" w:w="1290"/>
+            <w:shd w:fill="F8FAFC"/>
+            <w:tcMar>
+              <w:top w:w="50" w:type="dxa"/>
+              <w:bottom w:w="50" w:type="dxa"/>
+              <w:left w:w="60" w:type="dxa"/>
+              <w:right w:w="60" w:type="dxa"/>
+            </w:tcMar>
+          </w:tcPr>
+          <w:p>
+            <w:r>
+              <w:rPr>
+                <w:rFonts w:ascii="Arial" w:hAnsi="Arial"/>
+                <w:sz w:val="15"/>
+              </w:rPr>
+              <w:t>a47cd6aefe3a88a7...</w:t>
+            </w:r>
+          </w:p>
+        </w:tc>
+        <w:tc>
+          <w:tcPr>
+            <w:tcW w:type="dxa" w:w="1290"/>
+            <w:shd w:fill="F8FAFC"/>
+            <w:tcMar>
+              <w:top w:w="50" w:type="dxa"/>
+              <w:bottom w:w="50" w:type="dxa"/>
+              <w:left w:w="60" w:type="dxa"/>
+              <w:right w:w="60" w:type="dxa"/>
+            </w:tcMar>
+          </w:tcPr>
+          <w:p>
+            <w:r>
+              <w:rPr>
+                <w:rFonts w:ascii="Arial" w:hAnsi="Arial"/>
+                <w:sz w:val="15"/>
+              </w:rPr>
+              <w:t>Tái dựng 11/10 (từ ghi chép 05/10)</w:t>
+            </w:r>
+          </w:p>
+        </w:tc>
+        <w:tc>
+          <w:tcPr>
+            <w:tcW w:type="dxa" w:w="1290"/>
+            <w:shd w:fill="F8FAFC"/>
+            <w:tcMar>
+              <w:top w:w="50" w:type="dxa"/>
+              <w:bottom w:w="50" w:type="dxa"/>
+              <w:left w:w="60" w:type="dxa"/>
+              <w:right w:w="60" w:type="dxa"/>
+            </w:tcMar>
+          </w:tcPr>
+          <w:p>
+            <w:r>
+              <w:rPr>
+                <w:rFonts w:ascii="Arial" w:hAnsi="Arial"/>
+                <w:b/>
+                <w:sz w:val="15"/>
+              </w:rPr>
+              <w:t>71.43% (10/14)</w:t>
+            </w:r>
+          </w:p>
+        </w:tc>
+        <w:tc>
+          <w:tcPr>
+            <w:tcW w:type="dxa" w:w="1290"/>
+            <w:shd w:fill="F8FAFC"/>
+            <w:tcMar>
+              <w:top w:w="50" w:type="dxa"/>
+              <w:bottom w:w="50" w:type="dxa"/>
+              <w:left w:w="60" w:type="dxa"/>
+              <w:right w:w="60" w:type="dxa"/>
+            </w:tcMar>
+          </w:tcPr>
+          <w:p>
+            <w:r>
+              <w:rPr>
+                <w:rFonts w:ascii="Arial" w:hAnsi="Arial"/>
+                <w:sz w:val="15"/>
+              </w:rPr>
+              <w:t>Bản sơ khai: vẽ hẹp sát mép trong, Standee #3 rơi chân ngoài ROI -&gt; FN</w:t>
+            </w:r>
+          </w:p>
+        </w:tc>
+      </w:tr>
+      <w:tr>
+        <w:tc>
+          <w:tcPr>
+            <w:tcW w:type="dxa" w:w="1290"/>
+            <w:shd w:fill="FFFFFF"/>
+            <w:tcMar>
+              <w:top w:w="50" w:type="dxa"/>
+              <w:bottom w:w="50" w:type="dxa"/>
+              <w:left w:w="60" w:type="dxa"/>
+              <w:right w:w="60" w:type="dxa"/>
+            </w:tcMar>
+          </w:tcPr>
+          <w:p>
+            <w:r>
+              <w:rPr>
+                <w:rFonts w:ascii="Arial" w:hAnsi="Arial"/>
+                <w:b/>
+                <w:color w:val="1E3A8A"/>
+                <w:sz w:val="15"/>
+              </w:rPr>
+              <w:t>Version B</w:t>
+            </w:r>
+          </w:p>
+        </w:tc>
+        <w:tc>
+          <w:tcPr>
+            <w:tcW w:type="dxa" w:w="1290"/>
+            <w:shd w:fill="FFFFFF"/>
+            <w:tcMar>
+              <w:top w:w="50" w:type="dxa"/>
+              <w:bottom w:w="50" w:type="dxa"/>
+              <w:left w:w="60" w:type="dxa"/>
+              <w:right w:w="60" w:type="dxa"/>
+            </w:tcMar>
+          </w:tcPr>
+          <w:p>
+            <w:r>
+              <w:rPr>
+                <w:rFonts w:ascii="Arial" w:hAnsi="Arial"/>
+                <w:sz w:val="15"/>
+              </w:rPr>
+              <w:t>roi_video_test_version_b.json (chuẩn)</w:t>
+            </w:r>
+          </w:p>
+        </w:tc>
+        <w:tc>
+          <w:tcPr>
+            <w:tcW w:type="dxa" w:w="1290"/>
+            <w:shd w:fill="FFFFFF"/>
+            <w:tcMar>
+              <w:top w:w="50" w:type="dxa"/>
+              <w:bottom w:w="50" w:type="dxa"/>
+              <w:left w:w="60" w:type="dxa"/>
+              <w:right w:w="60" w:type="dxa"/>
+            </w:tcMar>
+          </w:tcPr>
+          <w:p>
+            <w:r>
+              <w:rPr>
+                <w:rFonts w:ascii="Arial" w:hAnsi="Arial"/>
+                <w:sz w:val="15"/>
+              </w:rPr>
+              <w:t>8 đỉnh</w:t>
+            </w:r>
+          </w:p>
+        </w:tc>
+        <w:tc>
+          <w:tcPr>
+            <w:tcW w:type="dxa" w:w="1290"/>
+            <w:shd w:fill="FFFFFF"/>
+            <w:tcMar>
+              <w:top w:w="50" w:type="dxa"/>
+              <w:bottom w:w="50" w:type="dxa"/>
+              <w:left w:w="60" w:type="dxa"/>
+              <w:right w:w="60" w:type="dxa"/>
+            </w:tcMar>
+          </w:tcPr>
+          <w:p>
+            <w:r>
+              <w:rPr>
+                <w:rFonts w:ascii="Arial" w:hAnsi="Arial"/>
+                <w:sz w:val="15"/>
+              </w:rPr>
+              <w:t>8c5840b81cd34eaa...</w:t>
+            </w:r>
+          </w:p>
+        </w:tc>
+        <w:tc>
+          <w:tcPr>
+            <w:tcW w:type="dxa" w:w="1290"/>
+            <w:shd w:fill="FFFFFF"/>
+            <w:tcMar>
+              <w:top w:w="50" w:type="dxa"/>
+              <w:bottom w:w="50" w:type="dxa"/>
+              <w:left w:w="60" w:type="dxa"/>
+              <w:right w:w="60" w:type="dxa"/>
+            </w:tcMar>
+          </w:tcPr>
+          <w:p>
+            <w:r>
+              <w:rPr>
+                <w:rFonts w:ascii="Arial" w:hAnsi="Arial"/>
+                <w:sz w:val="15"/>
+              </w:rPr>
+              <w:t>2026-10-08 22:23:56 (Đóng băng)</w:t>
+            </w:r>
+          </w:p>
+        </w:tc>
+        <w:tc>
+          <w:tcPr>
+            <w:tcW w:type="dxa" w:w="1290"/>
+            <w:shd w:fill="FFFFFF"/>
+            <w:tcMar>
+              <w:top w:w="50" w:type="dxa"/>
+              <w:bottom w:w="50" w:type="dxa"/>
+              <w:left w:w="60" w:type="dxa"/>
+              <w:right w:w="60" w:type="dxa"/>
+            </w:tcMar>
+          </w:tcPr>
+          <w:p>
+            <w:r>
+              <w:rPr>
+                <w:rFonts w:ascii="Arial" w:hAnsi="Arial"/>
+                <w:b/>
+                <w:sz w:val="15"/>
+              </w:rPr>
+              <w:t>78.57% (11/14)</w:t>
+            </w:r>
+          </w:p>
+        </w:tc>
+        <w:tc>
+          <w:tcPr>
+            <w:tcW w:type="dxa" w:w="1290"/>
+            <w:shd w:fill="FFFFFF"/>
+            <w:tcMar>
+              <w:top w:w="50" w:type="dxa"/>
+              <w:bottom w:w="50" w:type="dxa"/>
+              <w:left w:w="60" w:type="dxa"/>
+              <w:right w:w="60" w:type="dxa"/>
+            </w:tcMar>
+          </w:tcPr>
+          <w:p>
+            <w:r>
+              <w:rPr>
+                <w:rFonts w:ascii="Arial" w:hAnsi="Arial"/>
+                <w:sz w:val="15"/>
+              </w:rPr>
+              <w:t>Bản chuẩn hóa chính thức: bao trọn vỉa hè, Standee #3 đè 77.0% -&gt; TP</w:t>
+            </w:r>
+          </w:p>
+        </w:tc>
+      </w:tr>
+      <w:tr>
+        <w:tc>
+          <w:tcPr>
+            <w:tcW w:type="dxa" w:w="1290"/>
+            <w:shd w:fill="F8FAFC"/>
+            <w:tcMar>
+              <w:top w:w="50" w:type="dxa"/>
+              <w:bottom w:w="50" w:type="dxa"/>
+              <w:left w:w="60" w:type="dxa"/>
+              <w:right w:w="60" w:type="dxa"/>
+            </w:tcMar>
+          </w:tcPr>
+          <w:p>
+            <w:r>
+              <w:rPr>
+                <w:rFonts w:ascii="Arial" w:hAnsi="Arial"/>
+                <w:b/>
+                <w:sz w:val="15"/>
+              </w:rPr>
+              <w:t>Version C</w:t>
+            </w:r>
+          </w:p>
+        </w:tc>
+        <w:tc>
+          <w:tcPr>
+            <w:tcW w:type="dxa" w:w="1290"/>
+            <w:shd w:fill="F8FAFC"/>
+            <w:tcMar>
+              <w:top w:w="50" w:type="dxa"/>
+              <w:bottom w:w="50" w:type="dxa"/>
+              <w:left w:w="60" w:type="dxa"/>
+              <w:right w:w="60" w:type="dxa"/>
+            </w:tcMar>
+          </w:tcPr>
+          <w:p>
+            <w:r>
+              <w:rPr>
+                <w:rFonts w:ascii="Arial" w:hAnsi="Arial"/>
+                <w:sz w:val="15"/>
+              </w:rPr>
+              <w:t>roi_video_test_version_c.json</w:t>
+            </w:r>
+          </w:p>
+        </w:tc>
+        <w:tc>
+          <w:tcPr>
+            <w:tcW w:type="dxa" w:w="1290"/>
+            <w:shd w:fill="F8FAFC"/>
+            <w:tcMar>
+              <w:top w:w="50" w:type="dxa"/>
+              <w:bottom w:w="50" w:type="dxa"/>
+              <w:left w:w="60" w:type="dxa"/>
+              <w:right w:w="60" w:type="dxa"/>
+            </w:tcMar>
+          </w:tcPr>
+          <w:p>
+            <w:r>
+              <w:rPr>
+                <w:rFonts w:ascii="Arial" w:hAnsi="Arial"/>
+                <w:sz w:val="15"/>
+              </w:rPr>
+              <w:t>6 đỉnh</w:t>
+            </w:r>
+          </w:p>
+        </w:tc>
+        <w:tc>
+          <w:tcPr>
+            <w:tcW w:type="dxa" w:w="1290"/>
+            <w:shd w:fill="F8FAFC"/>
+            <w:tcMar>
+              <w:top w:w="50" w:type="dxa"/>
+              <w:bottom w:w="50" w:type="dxa"/>
+              <w:left w:w="60" w:type="dxa"/>
+              <w:right w:w="60" w:type="dxa"/>
+            </w:tcMar>
+          </w:tcPr>
+          <w:p>
+            <w:r>
+              <w:rPr>
+                <w:rFonts w:ascii="Arial" w:hAnsi="Arial"/>
+                <w:sz w:val="15"/>
+              </w:rPr>
+              <w:t>eed72b3341b56109...</w:t>
+            </w:r>
+          </w:p>
+        </w:tc>
+        <w:tc>
+          <w:tcPr>
+            <w:tcW w:type="dxa" w:w="1290"/>
+            <w:shd w:fill="F8FAFC"/>
+            <w:tcMar>
+              <w:top w:w="50" w:type="dxa"/>
+              <w:bottom w:w="50" w:type="dxa"/>
+              <w:left w:w="60" w:type="dxa"/>
+              <w:right w:w="60" w:type="dxa"/>
+            </w:tcMar>
+          </w:tcPr>
+          <w:p>
+            <w:r>
+              <w:rPr>
+                <w:rFonts w:ascii="Arial" w:hAnsi="Arial"/>
+                <w:sz w:val="15"/>
+              </w:rPr>
+              <w:t>2026-10-12 14:27:30 (Thử nghiệm)</w:t>
+            </w:r>
+          </w:p>
+        </w:tc>
+        <w:tc>
+          <w:tcPr>
+            <w:tcW w:type="dxa" w:w="1290"/>
+            <w:shd w:fill="F8FAFC"/>
+            <w:tcMar>
+              <w:top w:w="50" w:type="dxa"/>
+              <w:bottom w:w="50" w:type="dxa"/>
+              <w:left w:w="60" w:type="dxa"/>
+              <w:right w:w="60" w:type="dxa"/>
+            </w:tcMar>
+          </w:tcPr>
+          <w:p>
+            <w:r>
+              <w:rPr>
+                <w:rFonts w:ascii="Arial" w:hAnsi="Arial"/>
+                <w:b/>
+                <w:sz w:val="15"/>
+              </w:rPr>
+              <w:t>Overlap 63.1%</w:t>
+            </w:r>
+          </w:p>
+        </w:tc>
+        <w:tc>
+          <w:tcPr>
+            <w:tcW w:type="dxa" w:w="1290"/>
+            <w:shd w:fill="F8FAFC"/>
+            <w:tcMar>
+              <w:top w:w="50" w:type="dxa"/>
+              <w:bottom w:w="50" w:type="dxa"/>
+              <w:left w:w="60" w:type="dxa"/>
+              <w:right w:w="60" w:type="dxa"/>
+            </w:tcMar>
+          </w:tcPr>
+          <w:p>
+            <w:r>
+              <w:rPr>
+                <w:rFonts w:ascii="Arial" w:hAnsi="Arial"/>
+                <w:sz w:val="15"/>
+              </w:rPr>
+              <w:t>Bản thử nghiệm Web Studio: rút gọn đỉnh làm giảm overlap; đã loại khỏi benchmark</w:t>
+            </w:r>
+          </w:p>
+        </w:tc>
+      </w:tr>
+    </w:tbl>
+    <w:p>
+      <w:pPr>
+        <w:pStyle w:val="Caption"/>
+      </w:pPr>
+      <w:r>
+        <w:t>Mã băm Ground Truth đối soát độc lập: configs/video_ground_truth.json (16 đối tượng kiểm thử) — SHA-256: 590d0f201fefcae6a72ff9449ba2cc8164a0712a40c63c9d03afbe9ad351e93d (Đóng băng vĩnh viễn).</w:t>
+      </w:r>
+    </w:p>
+    <w:p>
+      <w:pPr>
+        <w:spacing w:after="200"/>
+      </w:pPr>
+    </w:p>
+    <w:p>
+      <w:pPr>
         <w:pStyle w:val="Heading1"/>
         <w:spacing w:before="240" w:after="120"/>
       </w:pPr>
       <w:r>
-        <w:t>5. Phân Tích Minh Bạch Giới Hạn Kỹ Thuật &amp; Hướng Phát Triển</w:t>
+        <w:t>5. Phân Tích Giới Hạn Kỹ Thuật &amp; Mối Đe Dọa Tính Hợp Lệ (Threats to Validity)</w:t>
       </w:r>
     </w:p>
     <w:p>
@@ -4670,7 +5787,7 @@
           <w:color w:val="1E293B"/>
           <w:sz w:val="19"/>
         </w:rPr>
-        <w:t xml:space="preserve">1. Bounding Box hình chữ nhật vs Instance Segmentation: </w:t>
+        <w:t xml:space="preserve">1. Suy luận hình học 2D thay vì mặt phẳng đất 3D (2D Bbox vs Ground Plane): </w:t>
       </w:r>
       <w:r>
         <w:rPr>
@@ -4678,7 +5795,7 @@
           <w:color w:val="1E293B"/>
           <w:sz w:val="19"/>
         </w:rPr>
-        <w:t>Hệ thống hiện sử dụng Bounding Box từ YOLOv8 Detection. Đối với các biển nghiêng góc hoặc có hình dạng bất thường, diện tích hộp bao quanh có thể chiếm thêm khoảng trống. Hướng phát triển: Chuyển sang mô hình YOLOv8-seg (Instance Segmentation) để trích xuất Pixel Mask chính xác theo từng đường viền biển hiệu.</w:t>
+        <w:t>Tỷ lệ lấn chiếm hiện đo bằng tỷ lệ diện tích Bounding Box 2D và đa giác vỉa hè trên ảnh camera. Nguy cơ: Biển gắn tường hoặc biển vẫy trên cao có thể chiếu đè lên vỉa hè nếu góc camera nghiêng sâu. Mặc dù quy tắc chân đế tiếp đất đã loại trừ phần lớn, nhưng biển gắn tường tầm thấp đứng lâu vẫn có nguy cơ báo nhầm. Hướng phát triển: Sử dụng Ma trận biến đổi phối cảnh ngược (Inverse Perspective Mapping - IPM / Homography) để chiếu tọa độ chân biển về mặt phẳng đất (Ground Plane) trước khi phán quyết.</w:t>
       </w:r>
     </w:p>
     <w:p>
@@ -4693,7 +5810,7 @@
           <w:color w:val="1E293B"/>
           <w:sz w:val="19"/>
         </w:rPr>
-        <w:t xml:space="preserve">2. Nhận biết tính kiên cố dài hạn (Cross-session Persistence): </w:t>
+        <w:t xml:space="preserve">2. Mối đe dọa về kích thước mẫu thực nghiệm (Threats to Validity): </w:t>
       </w:r>
       <w:r>
         <w:rPr>
@@ -4701,7 +5818,7 @@
           <w:color w:val="1E293B"/>
           <w:sz w:val="19"/>
         </w:rPr>
-        <w:t>Ngưỡng xác nhận thời gian hiện tại là 3.0 giây (15 frames), giải quyết triệt để người đi bộ bê biển đi ngang. Tuy nhiên để phân biệt biển cắm kiên cố nhiều ngày so với xe tải đỗ tạm 15 phút, cần lưu trữ cơ sở dữ liệu dài hạn và thuật toán Re-identification đối soát vị trí qua các ngày.</w:t>
+        <w:t>Thực nghiệm toàn hệ thống hiện được thực hiện trên 3 đoạn clip (720 frames, 30 giây) tại Hà Nội. Đây là bài kiểm tra sơ bộ (Proof-of-Concept) để thẩm định tính khả thi của pipeline liên kết, chưa đại diện đầy đủ cho vận hành liên tục 24/7 dưới mọi điều kiện thời tiết. Đồ án không ngoại suy kết quả 0 cảnh báo sai trong 30 giây thành kết luận quy mô lớn cho mọi khung giờ.</w:t>
       </w:r>
     </w:p>
     <w:p>
@@ -4716,7 +5833,7 @@
           <w:color w:val="1E293B"/>
           <w:sz w:val="19"/>
         </w:rPr>
-        <w:t xml:space="preserve">3. Phép chiếu phối cảnh Homography 2D sang 3D thực địa: </w:t>
+        <w:t xml:space="preserve">3. Tỷ lệ dữ liệu tổng hợp (Synthetic Data) và Kiểm tra Perceptual Hash: </w:t>
       </w:r>
       <w:r>
         <w:rPr>
@@ -4724,7 +5841,53 @@
           <w:color w:val="1E293B"/>
           <w:sz w:val="19"/>
         </w:rPr>
-        <w:t>Tỷ lệ lấn chiếm hiện đo bằng tỷ lệ diện tích trên mặt phẳng ảnh 2D. Hướng phát triển tiếp theo là áp dụng ma trận biến đổi phối cảnh Homography để quy đổi chính xác diện tích chiếm dụng ra mét vuông (m2) thực tế ngoài đời.</w:t>
+        <w:t>Trong 862 ảnh huấn luyện, có 782 ảnh (90.7%) là ảnh tổng hợp sinh bởi Generative AI (Gemini, ChatGPT, Duck AI) nhằm bù đắp dữ liệu biển hiệu vỉa hè Việt Nam giai đoạn đầu. Kiểm tra mã băm tri giác (dHash 64-bit, reports/perceptual_hash_distances.csv) trên 72 khung hình video lấy mẫu cho thấy khoảng cách Hamming tối thiểu là 13/64 bits (không có cặp nào &lt;= 12 bits), và cả 72 khung hình đều có ảnh train gần nhất là 1 trong 13 ảnh tổng hợp. Điều này khẳng định không phát hiện trùng lặp gần giống ở mức toàn cục (global image level). Tuy nhiên, khoảng cách phân phối (domain shift) giữa ảnh sinh và cảm biến camera thực tế có thể ảnh hưởng đến năng lực tổng quát hóa trong môi trường thực địa phức tạp.</w:t>
+      </w:r>
+    </w:p>
+    <w:p>
+      <w:pPr>
+        <w:pStyle w:val="ListBullet"/>
+        <w:spacing w:after="80"/>
+      </w:pPr>
+      <w:r>
+        <w:rPr>
+          <w:rFonts w:ascii="Arial" w:hAnsi="Arial"/>
+          <w:b/>
+          <w:color w:val="1E293B"/>
+          <w:sz w:val="19"/>
+        </w:rPr>
+        <w:t xml:space="preserve">4. Hiện tượng rò rỉ dữ liệu (Data Leakage) ở tập ảnh tĩnh: </w:t>
+      </w:r>
+      <w:r>
+        <w:rPr>
+          <w:rFonts w:ascii="Arial" w:hAnsi="Arial"/>
+          <w:color w:val="1E293B"/>
+          <w:sz w:val="19"/>
+        </w:rPr>
+        <w:t>Trong 862 ảnh huấn luyện và 55 ảnh test, có 35 base image IDs dùng chung giữa hai tập do kỹ thuật tăng cường dữ liệu. Điều này khiến chỉ số mAP 81.4% trên ảnh tĩnh có phần lạc quan. Kết quả thực nghiệm trên chuỗi video thực tế mới là cơ sở phản ánh năng lực vận hành thực sự.</w:t>
+      </w:r>
+    </w:p>
+    <w:p>
+      <w:pPr>
+        <w:pStyle w:val="ListBullet"/>
+        <w:spacing w:after="80"/>
+      </w:pPr>
+      <w:r>
+        <w:rPr>
+          <w:rFonts w:ascii="Arial" w:hAnsi="Arial"/>
+          <w:b/>
+          <w:color w:val="1E293B"/>
+          <w:sz w:val="19"/>
+        </w:rPr>
+        <w:t xml:space="preserve">5. Định vị Hệ thống Hỗ trợ Ra Quyết định (Human-in-the-Loop): </w:t>
+      </w:r>
+      <w:r>
+        <w:rPr>
+          <w:rFonts w:ascii="Arial" w:hAnsi="Arial"/>
+          <w:color w:val="1E293B"/>
+          <w:sz w:val="19"/>
+        </w:rPr>
+        <w:t>Căn cứ Điều 12 Nghị định 168/2024/NĐ-CP (hiệu lực 01/01/2025), việc xử phạt đòi hỏi chứng minh tính 'trái phép' (không có giấy phép sử dụng tạm thời của UBND). Do đó, hệ thống được định vị là công cụ DSS hỗ trợ cán bộ lập hồ sơ bằng chứng, không thay thế hoàn toàn thẩm quyền ký duyệt pháp lý của con người.</w:t>
       </w:r>
     </w:p>
     <w:p>
@@ -5149,7 +6312,7 @@
           <w:color w:val="64748B"/>
           <w:sz w:val="20"/>
         </w:rPr>
-        <w:t>Hà Nội, Ngày 08 tháng 10 năm 2026</w:t>
+        <w:t>Hà Nội, Ngày 14 tháng 10 năm 2026</w:t>
         <w:br/>
         <w:t>Sinh viên thực hiện: Nguyễn Đức Tài Năng</w:t>
       </w:r>

</xml_diff>